<commit_message>
Replace Purview cleanup with delegated Teams deletion and updated data
</commit_message>
<xml_diff>
--- a/server/src/main/resources/mock-data/meeting-notes/Minutes of Meeting - Welcome leaflet format.docx
+++ b/server/src/main/resources/mock-data/meeting-notes/Minutes of Meeting - Welcome leaflet format.docx
@@ -9,12 +9,12 @@
     </w:p>
     <w:p>
       <w:r>
-        <w:t>Date and time: WORKDAY-4T16:00:00Z</w:t>
+        <w:t>Date and time: WORKDAY-2T09:00:00Z</w:t>
       </w:r>
     </w:p>
     <w:p>
       <w:r>
-        <w:t>Organizer: Johanna Lorenz</w:t>
+        <w:t>Organizer: Nicolai Dahl Madsen</w:t>
       </w:r>
     </w:p>
     <w:p>
@@ -24,7 +24,7 @@
     </w:p>
     <w:p>
       <w:r>
-        <w:t>Topic: follow-up-meeting-4</w:t>
+        <w:t>Topic: meeting-welcome-leaflet-format</w:t>
       </w:r>
     </w:p>
     <w:p>
@@ -34,12 +34,17 @@
     </w:p>
     <w:p>
       <w:r>
-        <w:t>The group has not chosen whether the welcome information should be one sheet or a folded leaflet.</w:t>
+        <w:t>The group reviewed the community open day arrangements. Most details are confirmed, and routine updates are recorded in the shared folder.</w:t>
       </w:r>
     </w:p>
     <w:p>
       <w:r>
-        <w:t>Arrange a 20-minute review with Johanna, Miriam, and Patti to choose the format before printing. No invitation or time has been arranged.</w:t>
+        <w:t>Action owner: Johanna Lorenz. A short follow-up meeting has not been scheduled. The group has not chosen between a one-sheet and folded leaflet. Johanna will bring samples to a short meeting so the team can choose before printing. No later completion update appears in the shared planning notes.</w:t>
+      </w:r>
+    </w:p>
+    <w:p>
+      <w:r>
+        <w:t>The group agreed to check progress at the next planning check-in.</w:t>
       </w:r>
     </w:p>
     <w:sectPr>

</xml_diff>